<commit_message>
update reports description in documentation
</commit_message>
<xml_diff>
--- a/ITI Examination System Documentation.docx
+++ b/ITI Examination System Documentation.docx
@@ -3028,6 +3028,9 @@
         <w:tab/>
       </w:r>
       <w:r>
+        <w:rPr>
+          <w:noProof/>
+        </w:rPr>
         <w:drawing>
           <wp:inline distT="0" distB="0" distL="0" distR="0" wp14:anchorId="41CF5A66" wp14:editId="26F341F2">
             <wp:extent cx="5636115" cy="2602789"/>
@@ -5673,14 +5676,7 @@
                                   <w:color w:val="211E1B"/>
                                   <w:sz w:val="48"/>
                                 </w:rPr>
-                                <w:t xml:space="preserve"> </w:t>
-                              </w:r>
-                              <w:r>
-                                <w:rPr>
-                                  <w:color w:val="211E1B"/>
-                                  <w:sz w:val="48"/>
-                                </w:rPr>
-                                <w:t>cont’d</w:t>
+                                <w:t xml:space="preserve"> cont’d</w:t>
                               </w:r>
                             </w:p>
                           </w:txbxContent>
@@ -5758,14 +5754,7 @@
                             <w:color w:val="211E1B"/>
                             <w:sz w:val="48"/>
                           </w:rPr>
-                          <w:t xml:space="preserve"> </w:t>
-                        </w:r>
-                        <w:r>
-                          <w:rPr>
-                            <w:color w:val="211E1B"/>
-                            <w:sz w:val="48"/>
-                          </w:rPr>
-                          <w:t>cont’d</w:t>
+                          <w:t xml:space="preserve"> cont’d</w:t>
                         </w:r>
                       </w:p>
                     </w:txbxContent>
@@ -6767,7 +6756,6 @@
           <w:szCs w:val="24"/>
         </w:rPr>
       </w:pPr>
-      <w:proofErr w:type="gramStart"/>
       <w:r>
         <w:rPr>
           <w:rFonts w:ascii="Cardo" w:eastAsia="Cardo" w:hAnsi="Cardo" w:cs="Cardo"/>
@@ -6775,17 +6763,7 @@
           <w:sz w:val="24"/>
           <w:szCs w:val="24"/>
         </w:rPr>
-        <w:t>Grade</w:t>
-      </w:r>
-      <w:proofErr w:type="gramEnd"/>
-      <w:r>
-        <w:rPr>
-          <w:rFonts w:ascii="Cardo" w:eastAsia="Cardo" w:hAnsi="Cardo" w:cs="Cardo"/>
-          <w:color w:val="211E1B"/>
-          <w:sz w:val="24"/>
-          <w:szCs w:val="24"/>
-        </w:rPr>
-        <w:t xml:space="preserve"> must be between 1 and 3 (1 ⟶ </w:t>
+        <w:t xml:space="preserve">Grade must be between 1 and 3 (1 ⟶ </w:t>
       </w:r>
       <w:proofErr w:type="gramStart"/>
       <w:r>
@@ -7026,14 +7004,7 @@
                                   <w:color w:val="211E1B"/>
                                   <w:sz w:val="48"/>
                                 </w:rPr>
-                                <w:t xml:space="preserve"> </w:t>
-                              </w:r>
-                              <w:r>
-                                <w:rPr>
-                                  <w:color w:val="211E1B"/>
-                                  <w:sz w:val="48"/>
-                                </w:rPr>
-                                <w:t>cont’d</w:t>
+                                <w:t xml:space="preserve"> cont’d</w:t>
                               </w:r>
                               <w:r>
                                 <w:rPr>
@@ -7118,14 +7089,7 @@
                             <w:color w:val="211E1B"/>
                             <w:sz w:val="48"/>
                           </w:rPr>
-                          <w:t xml:space="preserve"> </w:t>
-                        </w:r>
-                        <w:r>
-                          <w:rPr>
-                            <w:color w:val="211E1B"/>
-                            <w:sz w:val="48"/>
-                          </w:rPr>
-                          <w:t>cont’d</w:t>
+                          <w:t xml:space="preserve"> cont’d</w:t>
                         </w:r>
                         <w:r>
                           <w:rPr>
@@ -7541,15 +7505,7 @@
           <w:sz w:val="24"/>
           <w:szCs w:val="24"/>
         </w:rPr>
-        <w:t xml:space="preserve"> </w:t>
-      </w:r>
-      <w:r>
-        <w:rPr>
-          <w:color w:val="211E1B"/>
-          <w:sz w:val="24"/>
-          <w:szCs w:val="24"/>
-        </w:rPr>
-        <w:t>should be A or B or C</w:t>
+        <w:t xml:space="preserve"> should be A or B or C</w:t>
       </w:r>
     </w:p>
     <w:p>
@@ -8582,14 +8538,7 @@
                                   <w:color w:val="211E1B"/>
                                   <w:sz w:val="48"/>
                                 </w:rPr>
-                                <w:t xml:space="preserve"> </w:t>
-                              </w:r>
-                              <w:r>
-                                <w:rPr>
-                                  <w:color w:val="211E1B"/>
-                                  <w:sz w:val="48"/>
-                                </w:rPr>
-                                <w:t>cont’d</w:t>
+                                <w:t xml:space="preserve"> cont’d</w:t>
                               </w:r>
                             </w:p>
                           </w:txbxContent>
@@ -8667,14 +8616,7 @@
                             <w:color w:val="211E1B"/>
                             <w:sz w:val="48"/>
                           </w:rPr>
-                          <w:t xml:space="preserve"> </w:t>
-                        </w:r>
-                        <w:r>
-                          <w:rPr>
-                            <w:color w:val="211E1B"/>
-                            <w:sz w:val="48"/>
-                          </w:rPr>
-                          <w:t>cont’d</w:t>
+                          <w:t xml:space="preserve"> cont’d</w:t>
                         </w:r>
                       </w:p>
                     </w:txbxContent>
@@ -13351,7 +13293,31 @@
           <w:sz w:val="24"/>
           <w:szCs w:val="24"/>
         </w:rPr>
-        <w:t>Retrieves the exam grades of a specific student, including course details, final grade, maximum degree, and exam percentage.</w:t>
+        <w:t>Retrieves the exam grades of a specific student, including course details, final grade</w:t>
+      </w:r>
+      <w:r>
+        <w:rPr>
+          <w:color w:val="211E1B"/>
+          <w:sz w:val="24"/>
+          <w:szCs w:val="24"/>
+        </w:rPr>
+        <w:t xml:space="preserve"> </w:t>
+      </w:r>
+      <w:r>
+        <w:rPr>
+          <w:color w:val="211E1B"/>
+          <w:sz w:val="24"/>
+          <w:szCs w:val="24"/>
+        </w:rPr>
+        <w:t>as a</w:t>
+      </w:r>
+      <w:r>
+        <w:rPr>
+          <w:color w:val="211E1B"/>
+          <w:sz w:val="24"/>
+          <w:szCs w:val="24"/>
+        </w:rPr>
+        <w:t xml:space="preserve"> percentage.</w:t>
       </w:r>
     </w:p>
     <w:p>
@@ -13453,80 +13419,6 @@
           <w:ilvl w:val="0"/>
           <w:numId w:val="9"/>
         </w:numPr>
-        <w:spacing w:line="335" w:lineRule="auto"/>
-        <w:rPr>
-          <w:color w:val="211E1B"/>
-          <w:sz w:val="26"/>
-          <w:szCs w:val="26"/>
-        </w:rPr>
-      </w:pPr>
-      <w:r>
-        <w:rPr>
-          <w:color w:val="211E1B"/>
-          <w:sz w:val="24"/>
-          <w:szCs w:val="24"/>
-        </w:rPr>
-        <w:t>Retrieve all exams taken by the specified student.</w:t>
-      </w:r>
-    </w:p>
-    <w:p>
-      <w:pPr>
-        <w:numPr>
-          <w:ilvl w:val="0"/>
-          <w:numId w:val="9"/>
-        </w:numPr>
-        <w:spacing w:after="240" w:line="335" w:lineRule="auto"/>
-        <w:rPr>
-          <w:color w:val="211E1B"/>
-          <w:sz w:val="26"/>
-          <w:szCs w:val="26"/>
-        </w:rPr>
-      </w:pPr>
-      <w:r>
-        <w:rPr>
-          <w:color w:val="211E1B"/>
-          <w:sz w:val="24"/>
-          <w:szCs w:val="24"/>
-        </w:rPr>
-        <w:t>For each exam, retrieve the related course information.</w:t>
-      </w:r>
-    </w:p>
-    <w:p>
-      <w:pPr>
-        <w:spacing w:before="240" w:after="240" w:line="335" w:lineRule="auto"/>
-        <w:rPr>
-          <w:color w:val="211E1B"/>
-          <w:sz w:val="24"/>
-          <w:szCs w:val="24"/>
-        </w:rPr>
-      </w:pPr>
-    </w:p>
-    <w:p>
-      <w:pPr>
-        <w:spacing w:before="240" w:after="240" w:line="335" w:lineRule="auto"/>
-        <w:rPr>
-          <w:color w:val="211E1B"/>
-          <w:sz w:val="24"/>
-          <w:szCs w:val="24"/>
-        </w:rPr>
-      </w:pPr>
-    </w:p>
-    <w:p>
-      <w:pPr>
-        <w:spacing w:before="240" w:after="240" w:line="335" w:lineRule="auto"/>
-        <w:rPr>
-          <w:color w:val="211E1B"/>
-          <w:sz w:val="24"/>
-          <w:szCs w:val="24"/>
-        </w:rPr>
-      </w:pPr>
-    </w:p>
-    <w:p>
-      <w:pPr>
-        <w:numPr>
-          <w:ilvl w:val="0"/>
-          <w:numId w:val="9"/>
-        </w:numPr>
         <w:spacing w:before="240" w:line="335" w:lineRule="auto"/>
         <w:rPr>
           <w:color w:val="211E1B"/>
@@ -13630,71 +13522,13 @@
         </w:rPr>
         <w:t>Final exam grade</w:t>
       </w:r>
-    </w:p>
-    <w:p>
-      <w:pPr>
-        <w:numPr>
-          <w:ilvl w:val="1"/>
-          <w:numId w:val="9"/>
-        </w:numPr>
-        <w:spacing w:line="335" w:lineRule="auto"/>
-        <w:rPr>
-          <w:color w:val="211E1B"/>
-          <w:sz w:val="24"/>
-          <w:szCs w:val="24"/>
-        </w:rPr>
-      </w:pPr>
-      <w:r>
-        <w:rPr>
-          <w:color w:val="211E1B"/>
-          <w:sz w:val="24"/>
-          <w:szCs w:val="24"/>
-        </w:rPr>
-        <w:t>Maximum course degree</w:t>
-      </w:r>
-    </w:p>
-    <w:p>
-      <w:pPr>
-        <w:numPr>
-          <w:ilvl w:val="1"/>
-          <w:numId w:val="9"/>
-        </w:numPr>
-        <w:spacing w:line="335" w:lineRule="auto"/>
-        <w:rPr>
-          <w:color w:val="211E1B"/>
-          <w:sz w:val="24"/>
-          <w:szCs w:val="24"/>
-        </w:rPr>
-      </w:pPr>
-      <w:r>
-        <w:rPr>
-          <w:color w:val="211E1B"/>
-          <w:sz w:val="24"/>
-          <w:szCs w:val="24"/>
-        </w:rPr>
-        <w:t>Exam percentage calculated from the final grade and maximum degree</w:t>
-      </w:r>
-    </w:p>
-    <w:p>
-      <w:pPr>
-        <w:numPr>
-          <w:ilvl w:val="0"/>
-          <w:numId w:val="9"/>
-        </w:numPr>
-        <w:spacing w:after="240" w:line="335" w:lineRule="auto"/>
-        <w:rPr>
-          <w:color w:val="211E1B"/>
-          <w:sz w:val="24"/>
-          <w:szCs w:val="24"/>
-        </w:rPr>
-      </w:pPr>
-      <w:r>
-        <w:rPr>
-          <w:color w:val="211E1B"/>
-          <w:sz w:val="24"/>
-          <w:szCs w:val="24"/>
-        </w:rPr>
-        <w:t>Return the result set for reporting purposes.</w:t>
+      <w:r>
+        <w:rPr>
+          <w:color w:val="211E1B"/>
+          <w:sz w:val="24"/>
+          <w:szCs w:val="24"/>
+        </w:rPr>
+        <w:t xml:space="preserve"> as percentage</w:t>
       </w:r>
     </w:p>
     <w:p>
@@ -13718,6 +13552,7 @@
           <w:sz w:val="26"/>
           <w:szCs w:val="26"/>
         </w:rPr>
+        <w:lastRenderedPageBreak/>
         <w:t>10.6 Instructor Courses report</w:t>
       </w:r>
     </w:p>
@@ -16875,6 +16710,7 @@
   <w:style w:type="character" w:default="1" w:styleId="DefaultParagraphFont">
     <w:name w:val="Default Paragraph Font"/>
     <w:uiPriority w:val="1"/>
+    <w:semiHidden/>
     <w:unhideWhenUsed/>
   </w:style>
   <w:style w:type="table" w:default="1" w:styleId="TableNormal">

</xml_diff>

<commit_message>
add note for empty tables in reports
</commit_message>
<xml_diff>
--- a/ITI Examination System Documentation.docx
+++ b/ITI Examination System Documentation.docx
@@ -6756,6 +6756,7 @@
           <w:szCs w:val="24"/>
         </w:rPr>
       </w:pPr>
+      <w:proofErr w:type="gramStart"/>
       <w:r>
         <w:rPr>
           <w:rFonts w:ascii="Cardo" w:eastAsia="Cardo" w:hAnsi="Cardo" w:cs="Cardo"/>
@@ -6763,7 +6764,17 @@
           <w:sz w:val="24"/>
           <w:szCs w:val="24"/>
         </w:rPr>
-        <w:t xml:space="preserve">Grade must be between 1 and 3 (1 ⟶ </w:t>
+        <w:t>Grade</w:t>
+      </w:r>
+      <w:proofErr w:type="gramEnd"/>
+      <w:r>
+        <w:rPr>
+          <w:rFonts w:ascii="Cardo" w:eastAsia="Cardo" w:hAnsi="Cardo" w:cs="Cardo"/>
+          <w:color w:val="211E1B"/>
+          <w:sz w:val="24"/>
+          <w:szCs w:val="24"/>
+        </w:rPr>
+        <w:t xml:space="preserve"> must be between 1 and 3 (1 ⟶ </w:t>
       </w:r>
       <w:proofErr w:type="gramStart"/>
       <w:r>
@@ -9626,19 +9637,298 @@
     </w:p>
     <w:p>
       <w:pPr>
-        <w:spacing w:before="240" w:after="240"/>
-        <w:rPr>
-          <w:color w:val="211E1B"/>
-        </w:rPr>
-      </w:pPr>
-    </w:p>
-    <w:p>
-      <w:pPr>
-        <w:spacing w:before="240" w:after="240"/>
-        <w:rPr>
-          <w:color w:val="211E1B"/>
-        </w:rPr>
-      </w:pPr>
+        <w:rPr>
+          <w:color w:val="211E1B"/>
+        </w:rPr>
+      </w:pPr>
+    </w:p>
+    <w:p>
+      <w:pPr>
+        <w:rPr>
+          <w:color w:val="211E1B"/>
+        </w:rPr>
+      </w:pPr>
+    </w:p>
+    <w:p>
+      <w:pPr>
+        <w:rPr>
+          <w:color w:val="211E1B"/>
+        </w:rPr>
+      </w:pPr>
+    </w:p>
+    <w:p>
+      <w:pPr>
+        <w:numPr>
+          <w:ilvl w:val="0"/>
+          <w:numId w:val="12"/>
+        </w:numPr>
+        <w:spacing w:line="335" w:lineRule="auto"/>
+        <w:rPr>
+          <w:b/>
+          <w:bCs/>
+          <w:color w:val="211E1B"/>
+          <w:lang w:val="en-US"/>
+        </w:rPr>
+      </w:pPr>
+      <w:r>
+        <w:rPr>
+          <w:b/>
+          <w:bCs/>
+          <w:color w:val="211E1B"/>
+          <w:sz w:val="26"/>
+          <w:szCs w:val="26"/>
+        </w:rPr>
+        <w:t>Initial State of Dynamic Tables</w:t>
+      </w:r>
+    </w:p>
+    <w:p>
+      <w:pPr>
+        <w:ind w:left="360"/>
+        <w:rPr>
+          <w:color w:val="211E1B"/>
+          <w:lang w:val="en-US"/>
+        </w:rPr>
+      </w:pPr>
+      <w:r>
+        <w:rPr>
+          <w:color w:val="211E1B"/>
+          <w:lang w:val="en-US"/>
+        </w:rPr>
+        <w:t>The following tables are initially empty and populated during system execution</w:t>
+      </w:r>
+      <w:r>
+        <w:rPr>
+          <w:color w:val="211E1B"/>
+          <w:lang w:val="en-US"/>
+        </w:rPr>
+        <w:t xml:space="preserve"> in the application</w:t>
+      </w:r>
+      <w:r>
+        <w:rPr>
+          <w:color w:val="211E1B"/>
+          <w:lang w:val="en-US"/>
+        </w:rPr>
+        <w:t>:</w:t>
+      </w:r>
+    </w:p>
+    <w:p>
+      <w:pPr>
+        <w:numPr>
+          <w:ilvl w:val="0"/>
+          <w:numId w:val="18"/>
+        </w:numPr>
+        <w:tabs>
+          <w:tab w:val="clear" w:pos="720"/>
+          <w:tab w:val="num" w:pos="1080"/>
+        </w:tabs>
+        <w:ind w:left="1080"/>
+        <w:rPr>
+          <w:color w:val="211E1B"/>
+          <w:lang w:val="en-US"/>
+        </w:rPr>
+      </w:pPr>
+      <w:r>
+        <w:rPr>
+          <w:b/>
+          <w:bCs/>
+          <w:color w:val="211E1B"/>
+          <w:lang w:val="en-US"/>
+        </w:rPr>
+        <w:t>Exam</w:t>
+      </w:r>
+      <w:r>
+        <w:rPr>
+          <w:color w:val="211E1B"/>
+          <w:lang w:val="en-US"/>
+        </w:rPr>
+        <w:t xml:space="preserve">: </w:t>
+      </w:r>
+      <w:r>
+        <w:rPr>
+          <w:color w:val="211E1B"/>
+          <w:lang w:val="en-US"/>
+        </w:rPr>
+        <w:t>Filled</w:t>
+      </w:r>
+      <w:r>
+        <w:rPr>
+          <w:color w:val="211E1B"/>
+          <w:lang w:val="en-US"/>
+        </w:rPr>
+        <w:t xml:space="preserve"> when an exam is generated using </w:t>
+      </w:r>
+      <w:proofErr w:type="spellStart"/>
+      <w:r>
+        <w:rPr>
+          <w:color w:val="211E1B"/>
+          <w:lang w:val="en-US"/>
+        </w:rPr>
+        <w:t>sp_Exam_Generation</w:t>
+      </w:r>
+      <w:proofErr w:type="spellEnd"/>
+      <w:r>
+        <w:rPr>
+          <w:color w:val="211E1B"/>
+          <w:lang w:val="en-US"/>
+        </w:rPr>
+        <w:t>.</w:t>
+      </w:r>
+    </w:p>
+    <w:p>
+      <w:pPr>
+        <w:numPr>
+          <w:ilvl w:val="0"/>
+          <w:numId w:val="18"/>
+        </w:numPr>
+        <w:tabs>
+          <w:tab w:val="clear" w:pos="720"/>
+          <w:tab w:val="num" w:pos="1080"/>
+        </w:tabs>
+        <w:ind w:left="1080"/>
+        <w:rPr>
+          <w:color w:val="211E1B"/>
+          <w:lang w:val="en-US"/>
+        </w:rPr>
+      </w:pPr>
+      <w:proofErr w:type="spellStart"/>
+      <w:r>
+        <w:rPr>
+          <w:b/>
+          <w:bCs/>
+          <w:color w:val="211E1B"/>
+          <w:lang w:val="en-US"/>
+        </w:rPr>
+        <w:t>Exam_Question</w:t>
+      </w:r>
+      <w:proofErr w:type="spellEnd"/>
+      <w:r>
+        <w:rPr>
+          <w:color w:val="211E1B"/>
+          <w:lang w:val="en-US"/>
+        </w:rPr>
+        <w:t>:</w:t>
+      </w:r>
+      <w:r>
+        <w:rPr>
+          <w:color w:val="211E1B"/>
+          <w:lang w:val="en-US"/>
+        </w:rPr>
+        <w:t xml:space="preserve"> Filled automatically when questions are assigned to a generated exam.</w:t>
+      </w:r>
+    </w:p>
+    <w:p>
+      <w:pPr>
+        <w:numPr>
+          <w:ilvl w:val="0"/>
+          <w:numId w:val="18"/>
+        </w:numPr>
+        <w:tabs>
+          <w:tab w:val="clear" w:pos="720"/>
+          <w:tab w:val="num" w:pos="1080"/>
+        </w:tabs>
+        <w:ind w:left="1080"/>
+        <w:rPr>
+          <w:color w:val="211E1B"/>
+          <w:lang w:val="en-US"/>
+        </w:rPr>
+      </w:pPr>
+      <w:proofErr w:type="spellStart"/>
+      <w:r>
+        <w:rPr>
+          <w:b/>
+          <w:bCs/>
+          <w:color w:val="211E1B"/>
+          <w:lang w:val="en-US"/>
+        </w:rPr>
+        <w:t>StudentAnswer</w:t>
+      </w:r>
+      <w:proofErr w:type="spellEnd"/>
+      <w:r>
+        <w:rPr>
+          <w:color w:val="211E1B"/>
+          <w:lang w:val="en-US"/>
+        </w:rPr>
+        <w:t>:</w:t>
+      </w:r>
+      <w:r>
+        <w:rPr>
+          <w:color w:val="211E1B"/>
+          <w:lang w:val="en-US"/>
+        </w:rPr>
+        <w:t xml:space="preserve"> </w:t>
+      </w:r>
+      <w:r>
+        <w:rPr>
+          <w:color w:val="211E1B"/>
+          <w:lang w:val="en-US"/>
+        </w:rPr>
+        <w:t>Filled after student submits answers in exam</w:t>
+      </w:r>
+      <w:r>
+        <w:rPr>
+          <w:color w:val="211E1B"/>
+          <w:lang w:val="en-US"/>
+        </w:rPr>
+        <w:t>.</w:t>
+      </w:r>
+    </w:p>
+    <w:p>
+      <w:pPr>
+        <w:numPr>
+          <w:ilvl w:val="0"/>
+          <w:numId w:val="18"/>
+        </w:numPr>
+        <w:tabs>
+          <w:tab w:val="clear" w:pos="720"/>
+          <w:tab w:val="num" w:pos="1080"/>
+        </w:tabs>
+        <w:ind w:left="1080"/>
+        <w:rPr>
+          <w:color w:val="211E1B"/>
+          <w:lang w:val="en-US"/>
+        </w:rPr>
+      </w:pPr>
+      <w:proofErr w:type="spellStart"/>
+      <w:r>
+        <w:rPr>
+          <w:b/>
+          <w:bCs/>
+          <w:color w:val="211E1B"/>
+          <w:lang w:val="en-US"/>
+        </w:rPr>
+        <w:t>Student_Exam</w:t>
+      </w:r>
+      <w:proofErr w:type="spellEnd"/>
+      <w:r>
+        <w:rPr>
+          <w:b/>
+          <w:bCs/>
+          <w:color w:val="211E1B"/>
+          <w:lang w:val="en-US"/>
+        </w:rPr>
+        <w:t>:</w:t>
+      </w:r>
+      <w:r>
+        <w:rPr>
+          <w:color w:val="211E1B"/>
+          <w:lang w:val="en-US"/>
+        </w:rPr>
+        <w:t xml:space="preserve"> </w:t>
+      </w:r>
+      <w:r>
+        <w:rPr>
+          <w:color w:val="211E1B"/>
+          <w:lang w:val="en-US"/>
+        </w:rPr>
+        <w:t>Filled after student submits answers in exam</w:t>
+      </w:r>
+      <w:r>
+        <w:rPr>
+          <w:color w:val="211E1B"/>
+          <w:lang w:val="en-US"/>
+        </w:rPr>
+        <w:t>.</w:t>
+      </w:r>
     </w:p>
     <w:p>
       <w:pPr>
@@ -14430,6 +14720,155 @@
     </w:lvl>
   </w:abstractNum>
   <w:abstractNum w:abstractNumId="2" w15:restartNumberingAfterBreak="0">
+    <w:nsid w:val="12DE0572"/>
+    <w:multiLevelType w:val="multilevel"/>
+    <w:tmpl w:val="511AE740"/>
+    <w:lvl w:ilvl="0">
+      <w:start w:val="1"/>
+      <w:numFmt w:val="bullet"/>
+      <w:lvlText w:val=""/>
+      <w:lvlJc w:val="left"/>
+      <w:pPr>
+        <w:tabs>
+          <w:tab w:val="num" w:pos="720"/>
+        </w:tabs>
+        <w:ind w:left="720" w:hanging="360"/>
+      </w:pPr>
+      <w:rPr>
+        <w:rFonts w:ascii="Symbol" w:hAnsi="Symbol" w:hint="default"/>
+        <w:sz w:val="20"/>
+      </w:rPr>
+    </w:lvl>
+    <w:lvl w:ilvl="1" w:tentative="1">
+      <w:start w:val="1"/>
+      <w:numFmt w:val="bullet"/>
+      <w:lvlText w:val="o"/>
+      <w:lvlJc w:val="left"/>
+      <w:pPr>
+        <w:tabs>
+          <w:tab w:val="num" w:pos="1440"/>
+        </w:tabs>
+        <w:ind w:left="1440" w:hanging="360"/>
+      </w:pPr>
+      <w:rPr>
+        <w:rFonts w:ascii="Courier New" w:hAnsi="Courier New" w:hint="default"/>
+        <w:sz w:val="20"/>
+      </w:rPr>
+    </w:lvl>
+    <w:lvl w:ilvl="2" w:tentative="1">
+      <w:start w:val="1"/>
+      <w:numFmt w:val="bullet"/>
+      <w:lvlText w:val=""/>
+      <w:lvlJc w:val="left"/>
+      <w:pPr>
+        <w:tabs>
+          <w:tab w:val="num" w:pos="2160"/>
+        </w:tabs>
+        <w:ind w:left="2160" w:hanging="360"/>
+      </w:pPr>
+      <w:rPr>
+        <w:rFonts w:ascii="Wingdings" w:hAnsi="Wingdings" w:hint="default"/>
+        <w:sz w:val="20"/>
+      </w:rPr>
+    </w:lvl>
+    <w:lvl w:ilvl="3" w:tentative="1">
+      <w:start w:val="1"/>
+      <w:numFmt w:val="bullet"/>
+      <w:lvlText w:val=""/>
+      <w:lvlJc w:val="left"/>
+      <w:pPr>
+        <w:tabs>
+          <w:tab w:val="num" w:pos="2880"/>
+        </w:tabs>
+        <w:ind w:left="2880" w:hanging="360"/>
+      </w:pPr>
+      <w:rPr>
+        <w:rFonts w:ascii="Wingdings" w:hAnsi="Wingdings" w:hint="default"/>
+        <w:sz w:val="20"/>
+      </w:rPr>
+    </w:lvl>
+    <w:lvl w:ilvl="4" w:tentative="1">
+      <w:start w:val="1"/>
+      <w:numFmt w:val="bullet"/>
+      <w:lvlText w:val=""/>
+      <w:lvlJc w:val="left"/>
+      <w:pPr>
+        <w:tabs>
+          <w:tab w:val="num" w:pos="3600"/>
+        </w:tabs>
+        <w:ind w:left="3600" w:hanging="360"/>
+      </w:pPr>
+      <w:rPr>
+        <w:rFonts w:ascii="Wingdings" w:hAnsi="Wingdings" w:hint="default"/>
+        <w:sz w:val="20"/>
+      </w:rPr>
+    </w:lvl>
+    <w:lvl w:ilvl="5" w:tentative="1">
+      <w:start w:val="1"/>
+      <w:numFmt w:val="bullet"/>
+      <w:lvlText w:val=""/>
+      <w:lvlJc w:val="left"/>
+      <w:pPr>
+        <w:tabs>
+          <w:tab w:val="num" w:pos="4320"/>
+        </w:tabs>
+        <w:ind w:left="4320" w:hanging="360"/>
+      </w:pPr>
+      <w:rPr>
+        <w:rFonts w:ascii="Wingdings" w:hAnsi="Wingdings" w:hint="default"/>
+        <w:sz w:val="20"/>
+      </w:rPr>
+    </w:lvl>
+    <w:lvl w:ilvl="6" w:tentative="1">
+      <w:start w:val="1"/>
+      <w:numFmt w:val="bullet"/>
+      <w:lvlText w:val=""/>
+      <w:lvlJc w:val="left"/>
+      <w:pPr>
+        <w:tabs>
+          <w:tab w:val="num" w:pos="5040"/>
+        </w:tabs>
+        <w:ind w:left="5040" w:hanging="360"/>
+      </w:pPr>
+      <w:rPr>
+        <w:rFonts w:ascii="Wingdings" w:hAnsi="Wingdings" w:hint="default"/>
+        <w:sz w:val="20"/>
+      </w:rPr>
+    </w:lvl>
+    <w:lvl w:ilvl="7" w:tentative="1">
+      <w:start w:val="1"/>
+      <w:numFmt w:val="bullet"/>
+      <w:lvlText w:val=""/>
+      <w:lvlJc w:val="left"/>
+      <w:pPr>
+        <w:tabs>
+          <w:tab w:val="num" w:pos="5760"/>
+        </w:tabs>
+        <w:ind w:left="5760" w:hanging="360"/>
+      </w:pPr>
+      <w:rPr>
+        <w:rFonts w:ascii="Wingdings" w:hAnsi="Wingdings" w:hint="default"/>
+        <w:sz w:val="20"/>
+      </w:rPr>
+    </w:lvl>
+    <w:lvl w:ilvl="8" w:tentative="1">
+      <w:start w:val="1"/>
+      <w:numFmt w:val="bullet"/>
+      <w:lvlText w:val=""/>
+      <w:lvlJc w:val="left"/>
+      <w:pPr>
+        <w:tabs>
+          <w:tab w:val="num" w:pos="6480"/>
+        </w:tabs>
+        <w:ind w:left="6480" w:hanging="360"/>
+      </w:pPr>
+      <w:rPr>
+        <w:rFonts w:ascii="Wingdings" w:hAnsi="Wingdings" w:hint="default"/>
+        <w:sz w:val="20"/>
+      </w:rPr>
+    </w:lvl>
+  </w:abstractNum>
+  <w:abstractNum w:abstractNumId="3" w15:restartNumberingAfterBreak="0">
     <w:nsid w:val="137814C6"/>
     <w:multiLevelType w:val="multilevel"/>
     <w:tmpl w:val="C0B22186"/>
@@ -14545,7 +14984,7 @@
       </w:rPr>
     </w:lvl>
   </w:abstractNum>
-  <w:abstractNum w:abstractNumId="3" w15:restartNumberingAfterBreak="0">
+  <w:abstractNum w:abstractNumId="4" w15:restartNumberingAfterBreak="0">
     <w:nsid w:val="158A15FE"/>
     <w:multiLevelType w:val="multilevel"/>
     <w:tmpl w:val="57C224CA"/>
@@ -14661,7 +15100,7 @@
       </w:rPr>
     </w:lvl>
   </w:abstractNum>
-  <w:abstractNum w:abstractNumId="4" w15:restartNumberingAfterBreak="0">
+  <w:abstractNum w:abstractNumId="5" w15:restartNumberingAfterBreak="0">
     <w:nsid w:val="16526E9F"/>
     <w:multiLevelType w:val="multilevel"/>
     <w:tmpl w:val="57C224CA"/>
@@ -14777,7 +15216,7 @@
       </w:rPr>
     </w:lvl>
   </w:abstractNum>
-  <w:abstractNum w:abstractNumId="5" w15:restartNumberingAfterBreak="0">
+  <w:abstractNum w:abstractNumId="6" w15:restartNumberingAfterBreak="0">
     <w:nsid w:val="1E9900D0"/>
     <w:multiLevelType w:val="multilevel"/>
     <w:tmpl w:val="C818BA6E"/>
@@ -14890,7 +15329,7 @@
       </w:rPr>
     </w:lvl>
   </w:abstractNum>
-  <w:abstractNum w:abstractNumId="6" w15:restartNumberingAfterBreak="0">
+  <w:abstractNum w:abstractNumId="7" w15:restartNumberingAfterBreak="0">
     <w:nsid w:val="21F14C92"/>
     <w:multiLevelType w:val="multilevel"/>
     <w:tmpl w:val="81C6FC62"/>
@@ -15006,7 +15445,7 @@
       </w:rPr>
     </w:lvl>
   </w:abstractNum>
-  <w:abstractNum w:abstractNumId="7" w15:restartNumberingAfterBreak="0">
+  <w:abstractNum w:abstractNumId="8" w15:restartNumberingAfterBreak="0">
     <w:nsid w:val="24587A75"/>
     <w:multiLevelType w:val="multilevel"/>
     <w:tmpl w:val="738C3D32"/>
@@ -15119,7 +15558,7 @@
       </w:rPr>
     </w:lvl>
   </w:abstractNum>
-  <w:abstractNum w:abstractNumId="8" w15:restartNumberingAfterBreak="0">
+  <w:abstractNum w:abstractNumId="9" w15:restartNumberingAfterBreak="0">
     <w:nsid w:val="27A63F0E"/>
     <w:multiLevelType w:val="multilevel"/>
     <w:tmpl w:val="5CDCC7C6"/>
@@ -15232,7 +15671,7 @@
       </w:rPr>
     </w:lvl>
   </w:abstractNum>
-  <w:abstractNum w:abstractNumId="9" w15:restartNumberingAfterBreak="0">
+  <w:abstractNum w:abstractNumId="10" w15:restartNumberingAfterBreak="0">
     <w:nsid w:val="300C0A85"/>
     <w:multiLevelType w:val="multilevel"/>
     <w:tmpl w:val="899C98CE"/>
@@ -15345,7 +15784,7 @@
       </w:rPr>
     </w:lvl>
   </w:abstractNum>
-  <w:abstractNum w:abstractNumId="10" w15:restartNumberingAfterBreak="0">
+  <w:abstractNum w:abstractNumId="11" w15:restartNumberingAfterBreak="0">
     <w:nsid w:val="367E458B"/>
     <w:multiLevelType w:val="multilevel"/>
     <w:tmpl w:val="79E84336"/>
@@ -15461,7 +15900,7 @@
       </w:rPr>
     </w:lvl>
   </w:abstractNum>
-  <w:abstractNum w:abstractNumId="11" w15:restartNumberingAfterBreak="0">
+  <w:abstractNum w:abstractNumId="12" w15:restartNumberingAfterBreak="0">
     <w:nsid w:val="36867691"/>
     <w:multiLevelType w:val="multilevel"/>
     <w:tmpl w:val="F8AA2AEA"/>
@@ -15574,7 +16013,7 @@
       </w:rPr>
     </w:lvl>
   </w:abstractNum>
-  <w:abstractNum w:abstractNumId="12" w15:restartNumberingAfterBreak="0">
+  <w:abstractNum w:abstractNumId="13" w15:restartNumberingAfterBreak="0">
     <w:nsid w:val="4C58083E"/>
     <w:multiLevelType w:val="multilevel"/>
     <w:tmpl w:val="57C224CA"/>
@@ -15690,7 +16129,7 @@
       </w:rPr>
     </w:lvl>
   </w:abstractNum>
-  <w:abstractNum w:abstractNumId="13" w15:restartNumberingAfterBreak="0">
+  <w:abstractNum w:abstractNumId="14" w15:restartNumberingAfterBreak="0">
     <w:nsid w:val="4DA207FE"/>
     <w:multiLevelType w:val="multilevel"/>
     <w:tmpl w:val="A4E44FBC"/>
@@ -15803,7 +16242,7 @@
       </w:rPr>
     </w:lvl>
   </w:abstractNum>
-  <w:abstractNum w:abstractNumId="14" w15:restartNumberingAfterBreak="0">
+  <w:abstractNum w:abstractNumId="15" w15:restartNumberingAfterBreak="0">
     <w:nsid w:val="598208AD"/>
     <w:multiLevelType w:val="multilevel"/>
     <w:tmpl w:val="06401A94"/>
@@ -15916,7 +16355,7 @@
       </w:rPr>
     </w:lvl>
   </w:abstractNum>
-  <w:abstractNum w:abstractNumId="15" w15:restartNumberingAfterBreak="0">
+  <w:abstractNum w:abstractNumId="16" w15:restartNumberingAfterBreak="0">
     <w:nsid w:val="68DD4659"/>
     <w:multiLevelType w:val="multilevel"/>
     <w:tmpl w:val="9E3868DC"/>
@@ -16029,7 +16468,7 @@
       </w:rPr>
     </w:lvl>
   </w:abstractNum>
-  <w:abstractNum w:abstractNumId="16" w15:restartNumberingAfterBreak="0">
+  <w:abstractNum w:abstractNumId="17" w15:restartNumberingAfterBreak="0">
     <w:nsid w:val="72905545"/>
     <w:multiLevelType w:val="multilevel"/>
     <w:tmpl w:val="0B4823C4"/>
@@ -16143,54 +16582,57 @@
     </w:lvl>
   </w:abstractNum>
   <w:num w:numId="1" w16cid:durableId="579829514">
+    <w:abstractNumId w:val="16"/>
+  </w:num>
+  <w:num w:numId="2" w16cid:durableId="121076893">
     <w:abstractNumId w:val="15"/>
   </w:num>
-  <w:num w:numId="2" w16cid:durableId="121076893">
-    <w:abstractNumId w:val="14"/>
+  <w:num w:numId="3" w16cid:durableId="1670476368">
+    <w:abstractNumId w:val="9"/>
   </w:num>
-  <w:num w:numId="3" w16cid:durableId="1670476368">
+  <w:num w:numId="4" w16cid:durableId="1266230005">
     <w:abstractNumId w:val="8"/>
   </w:num>
-  <w:num w:numId="4" w16cid:durableId="1266230005">
-    <w:abstractNumId w:val="7"/>
-  </w:num>
   <w:num w:numId="5" w16cid:durableId="214396032">
-    <w:abstractNumId w:val="13"/>
+    <w:abstractNumId w:val="14"/>
   </w:num>
   <w:num w:numId="6" w16cid:durableId="1958557003">
     <w:abstractNumId w:val="1"/>
   </w:num>
   <w:num w:numId="7" w16cid:durableId="1920598027">
-    <w:abstractNumId w:val="9"/>
+    <w:abstractNumId w:val="10"/>
   </w:num>
   <w:num w:numId="8" w16cid:durableId="111097613">
     <w:abstractNumId w:val="0"/>
   </w:num>
   <w:num w:numId="9" w16cid:durableId="147718301">
+    <w:abstractNumId w:val="6"/>
+  </w:num>
+  <w:num w:numId="10" w16cid:durableId="1648699970">
+    <w:abstractNumId w:val="17"/>
+  </w:num>
+  <w:num w:numId="11" w16cid:durableId="1434088975">
+    <w:abstractNumId w:val="12"/>
+  </w:num>
+  <w:num w:numId="12" w16cid:durableId="1617173326">
+    <w:abstractNumId w:val="7"/>
+  </w:num>
+  <w:num w:numId="13" w16cid:durableId="441270627">
     <w:abstractNumId w:val="5"/>
   </w:num>
-  <w:num w:numId="10" w16cid:durableId="1648699970">
-    <w:abstractNumId w:val="16"/>
+  <w:num w:numId="14" w16cid:durableId="4863154">
+    <w:abstractNumId w:val="13"/>
   </w:num>
-  <w:num w:numId="11" w16cid:durableId="1434088975">
+  <w:num w:numId="15" w16cid:durableId="1987588946">
+    <w:abstractNumId w:val="4"/>
+  </w:num>
+  <w:num w:numId="16" w16cid:durableId="636302450">
     <w:abstractNumId w:val="11"/>
   </w:num>
-  <w:num w:numId="12" w16cid:durableId="1617173326">
-    <w:abstractNumId w:val="6"/>
-  </w:num>
-  <w:num w:numId="13" w16cid:durableId="441270627">
-    <w:abstractNumId w:val="4"/>
-  </w:num>
-  <w:num w:numId="14" w16cid:durableId="4863154">
-    <w:abstractNumId w:val="12"/>
-  </w:num>
-  <w:num w:numId="15" w16cid:durableId="1987588946">
+  <w:num w:numId="17" w16cid:durableId="344869541">
     <w:abstractNumId w:val="3"/>
   </w:num>
-  <w:num w:numId="16" w16cid:durableId="636302450">
-    <w:abstractNumId w:val="10"/>
-  </w:num>
-  <w:num w:numId="17" w16cid:durableId="344869541">
+  <w:num w:numId="18" w16cid:durableId="314916460">
     <w:abstractNumId w:val="2"/>
   </w:num>
 </w:numbering>
@@ -16710,7 +17152,6 @@
   <w:style w:type="character" w:default="1" w:styleId="DefaultParagraphFont">
     <w:name w:val="Default Paragraph Font"/>
     <w:uiPriority w:val="1"/>
-    <w:semiHidden/>
     <w:unhideWhenUsed/>
   </w:style>
   <w:style w:type="table" w:default="1" w:styleId="TableNormal">

</xml_diff>